<commit_message>
Update Word dan PDF
</commit_message>
<xml_diff>
--- a/Tugas 3 Deteksi Objek Sederhana.docx
+++ b/Tugas 3 Deteksi Objek Sederhana.docx
@@ -457,18 +457,65 @@
         <w:tab/>
         <w:t>G.231.23.0135</w:t>
       </w:r>
-    </w:p>
-    <w:p>
-      <w:pPr>
-        <w:spacing w:line="360" w:lineRule="auto"/>
-        <w:jc w:val="center"/>
+      <w:r>
         <w:rPr>
           <w:rFonts w:ascii="Times New Roman" w:hAnsi="Times New Roman" w:cs="Times New Roman"/>
           <w:sz w:val="28"/>
           <w:szCs w:val="28"/>
           <w:lang w:val="en-US"/>
         </w:rPr>
-      </w:pPr>
+        <w:br/>
+        <w:t xml:space="preserve">Gilda Totty </w:t>
+      </w:r>
+      <w:proofErr w:type="spellStart"/>
+      <w:r>
+        <w:rPr>
+          <w:rFonts w:ascii="Times New Roman" w:hAnsi="Times New Roman" w:cs="Times New Roman"/>
+          <w:sz w:val="28"/>
+          <w:szCs w:val="28"/>
+          <w:lang w:val="en-US"/>
+        </w:rPr>
+        <w:t>Vialdo</w:t>
+      </w:r>
+      <w:proofErr w:type="spellEnd"/>
+      <w:r>
+        <w:rPr>
+          <w:rFonts w:ascii="Times New Roman" w:hAnsi="Times New Roman" w:cs="Times New Roman"/>
+          <w:sz w:val="28"/>
+          <w:szCs w:val="28"/>
+          <w:lang w:val="en-US"/>
+        </w:rPr>
+        <w:tab/>
+      </w:r>
+      <w:r>
+        <w:rPr>
+          <w:rFonts w:ascii="Times New Roman" w:hAnsi="Times New Roman" w:cs="Times New Roman"/>
+          <w:sz w:val="28"/>
+          <w:szCs w:val="28"/>
+          <w:lang w:val="en-US"/>
+        </w:rPr>
+        <w:tab/>
+      </w:r>
+      <w:r>
+        <w:rPr>
+          <w:rFonts w:ascii="Times New Roman" w:hAnsi="Times New Roman" w:cs="Times New Roman"/>
+          <w:sz w:val="28"/>
+          <w:szCs w:val="28"/>
+          <w:lang w:val="en-US"/>
+        </w:rPr>
+        <w:tab/>
+      </w:r>
+      <w:bookmarkStart w:id="0" w:name="_GoBack"/>
+      <w:bookmarkEnd w:id="0"/>
+      <w:r>
+        <w:rPr>
+          <w:rFonts w:ascii="Times New Roman" w:hAnsi="Times New Roman" w:cs="Times New Roman"/>
+          <w:sz w:val="28"/>
+          <w:szCs w:val="28"/>
+          <w:lang w:val="en-US"/>
+        </w:rPr>
+        <w:t>G.231.23.0176</w:t>
+      </w:r>
     </w:p>
     <w:p>
       <w:pPr>
@@ -12200,6 +12247,7 @@
       <w:r>
         <w:rPr>
           <w:rFonts w:ascii="Times New Roman" w:hAnsi="Times New Roman" w:cs="Times New Roman"/>
+          <w:noProof/>
           <w:sz w:val="24"/>
           <w:szCs w:val="24"/>
           <w:lang w:val="en-US"/>
@@ -12255,8 +12303,7 @@
           <w:lang w:val="en-US"/>
         </w:rPr>
       </w:pPr>
-      <w:bookmarkStart w:id="0" w:name="_GoBack"/>
-      <w:bookmarkEnd w:id="0"/>
+      <w:proofErr w:type="spellStart"/>
       <w:r>
         <w:rPr>
           <w:rFonts w:ascii="Times New Roman" w:hAnsi="Times New Roman" w:cs="Times New Roman"/>
@@ -12266,7 +12313,19 @@
           <w:szCs w:val="24"/>
           <w:lang w:val="en-US"/>
         </w:rPr>
-        <w:t xml:space="preserve">Tabel </w:t>
+        <w:t>Tabel</w:t>
+      </w:r>
+      <w:proofErr w:type="spellEnd"/>
+      <w:r>
+        <w:rPr>
+          <w:rFonts w:ascii="Times New Roman" w:hAnsi="Times New Roman" w:cs="Times New Roman"/>
+          <w:b/>
+          <w:i/>
+          <w:sz w:val="24"/>
+          <w:szCs w:val="24"/>
+          <w:lang w:val="en-US"/>
+        </w:rPr>
+        <w:t xml:space="preserve"> </w:t>
       </w:r>
       <w:proofErr w:type="spellStart"/>
       <w:r>
@@ -15332,7 +15391,7 @@
 </file>
 
 <file path=customXml/itemProps1.xml><?xml version="1.0" encoding="utf-8"?>
-<ds:datastoreItem xmlns:ds="http://schemas.openxmlformats.org/officeDocument/2006/customXml" ds:itemID="{10E6E9B9-2A9D-42E3-8FAF-2CC930EF197E}">
+<ds:datastoreItem xmlns:ds="http://schemas.openxmlformats.org/officeDocument/2006/customXml" ds:itemID="{84060E9B-8D5E-4DBF-B0D2-067E1ECFFFF9}">
   <ds:schemaRefs>
     <ds:schemaRef ds:uri="http://schemas.openxmlformats.org/officeDocument/2006/bibliography"/>
   </ds:schemaRefs>

</xml_diff>